<commit_message>
Basic Workflow end-to-end with Archivation of Immuno samples
</commit_message>
<xml_diff>
--- a/BT BASICS.docx
+++ b/BT BASICS.docx
@@ -155,6 +155,17 @@
             </a:graphic>
           </wp:inline>
         </w:drawing>
+      </w:r>
+    </w:p>
+    <w:p>
+      <w:r>
+        <w:br w:type="page"/>
+      </w:r>
+    </w:p>
+    <w:p>
+      <w:r>
+        <w:lastRenderedPageBreak/>
+        <w:br w:type="page"/>
       </w:r>
     </w:p>
     <w:p/>

</xml_diff>